<commit_message>
updated instructions for q4
</commit_message>
<xml_diff>
--- a/04_distrib_data_storage_foundations/lab_amazon_s3/lab_instructions_amazon_s3.docx
+++ b/04_distrib_data_storage_foundations/lab_amazon_s3/lab_instructions_amazon_s3.docx
@@ -17,15 +17,7 @@
       </w:r>
       <w:r>
         <w:rPr/>
-        <w:t>June</w:t>
-      </w:r>
-      <w:r>
-        <w:rPr/>
-        <w:t xml:space="preserve"> </w:t>
-      </w:r>
-      <w:r>
-        <w:rPr/>
-        <w:t>18</w:t>
+        <w:t>September 22</w:t>
       </w:r>
       <w:r>
         <w:rPr/>
@@ -156,20 +148,15 @@
       </w:pPr>
       <w:r>
         <w:rPr/>
-        <w:t xml:space="preserve">4) (1 PT) Set public access permissions on your bucket. Include a screenshot that shows your bucket name with </w:t>
-      </w:r>
-      <w:r>
-        <w:rPr/>
-        <w:t>the blocking of all public access turned off.</w:t>
-      </w:r>
-    </w:p>
-    <w:p>
-      <w:pPr>
-        <w:pStyle w:val="Normal"/>
-        <w:rPr/>
-      </w:pPr>
-      <w:r>
-        <w:rPr/>
+        <w:t>4) (1 PT) Set public access permissions on your bucket. Include a screenshot that shows your bucket name wit</w:t>
+      </w:r>
+      <w:r>
+        <w:rPr/>
+        <w:t xml:space="preserve">h </w:t>
+      </w:r>
+      <w:r>
+        <w:rPr/>
+        <w:t xml:space="preserve">evidence of public access permission. </w:t>
       </w:r>
     </w:p>
     <w:p>

</xml_diff>